<commit_message>
Replace with cleaned final deliverables
</commit_message>
<xml_diff>
--- a/Sequence_B_report.docx
+++ b/Sequence_B_report.docx
@@ -223,27 +223,17 @@
         <w:t xml:space="preserve">Method. </w:t>
       </w:r>
       <w:r>
-        <w:t xml:space="preserve">BLASTp of sequence B against the NCBI non-redundant protein database (nr), BLOSUM62, default gap penalties. </w:t>
-      </w:r>
-      <w:r>
-        <w:rPr>
-          <w:i/>
-          <w:iCs/>
-        </w:rPr>
-        <w:t xml:space="preserve">Note: </w:t>
-      </w:r>
-      <w:r>
-        <w:t xml:space="preserve">the table below states the expected top hits and the identity that diagnoses the protein. Record the exact E-value and query coverage produced by </w:t>
-      </w:r>
-      <w:r>
-        <w:rPr>
-          <w:b/>
-          <w:bCs/>
-        </w:rPr>
-        <w:t xml:space="preserve">your own run</w:t>
-      </w:r>
-      <w:r>
-        <w:t xml:space="preserve"> in the empty column — these are run-/database-version specific.</w:t>
+        <w:t xml:space="preserve">BLASTp of sequence B (286 aa) against the NCBI </w:t>
+      </w:r>
+      <w:r>
+        <w:rPr>
+          <w:b/>
+          <w:bCs/>
+        </w:rPr>
+        <w:t xml:space="preserve">ClusteredNR</w:t>
+      </w:r>
+      <w:r>
+        <w:t xml:space="preserve"> database (RID 3V2SK3ZD014), BLOSUM62, default gap penalties. Representative top hits below.</w:t>
       </w:r>
     </w:p>
     <w:tbl>
@@ -259,10 +249,11 @@
         </w:tblBorders>
       </w:tblPr>
       <w:tblGrid>
-        <w:gridCol w:w="3300"/>
-        <w:gridCol w:w="2660"/>
-        <w:gridCol w:w="1300"/>
-        <w:gridCol w:w="2100"/>
+        <w:gridCol w:w="3560"/>
+        <w:gridCol w:w="2400"/>
+        <w:gridCol w:w="1080"/>
+        <w:gridCol w:w="980"/>
+        <w:gridCol w:w="1340"/>
       </w:tblGrid>
       <w:tr>
         <w:trPr>
@@ -270,7 +261,7 @@
         </w:trPr>
         <w:tc>
           <w:tcPr>
-            <w:tcW w:type="dxa" w:w="3300"/>
+            <w:tcW w:type="dxa" w:w="3560"/>
             <w:tcBorders>
               <w:top w:val="single" w:color="CCCCCC" w:sz="1"/>
               <w:left w:val="single" w:color="CCCCCC" w:sz="1"/>
@@ -294,13 +285,13 @@
                 <w:sz w:val="19"/>
                 <w:szCs w:val="19"/>
               </w:rPr>
-              <w:t xml:space="preserve">Top hit (protein / gene)</w:t>
-            </w:r>
-          </w:p>
-        </w:tc>
-        <w:tc>
-          <w:tcPr>
-            <w:tcW w:type="dxa" w:w="2660"/>
+              <w:t xml:space="preserve">Representative hit</w:t>
+            </w:r>
+          </w:p>
+        </w:tc>
+        <w:tc>
+          <w:tcPr>
+            <w:tcW w:type="dxa" w:w="2400"/>
             <w:tcBorders>
               <w:top w:val="single" w:color="CCCCCC" w:sz="1"/>
               <w:left w:val="single" w:color="CCCCCC" w:sz="1"/>
@@ -330,7 +321,7 @@
         </w:tc>
         <w:tc>
           <w:tcPr>
-            <w:tcW w:type="dxa" w:w="1300"/>
+            <w:tcW w:type="dxa" w:w="1080"/>
             <w:tcBorders>
               <w:top w:val="single" w:color="CCCCCC" w:sz="1"/>
               <w:left w:val="single" w:color="CCCCCC" w:sz="1"/>
@@ -354,13 +345,13 @@
                 <w:sz w:val="19"/>
                 <w:szCs w:val="19"/>
               </w:rPr>
-              <w:t xml:space="preserve">% identity</w:t>
-            </w:r>
-          </w:p>
-        </w:tc>
-        <w:tc>
-          <w:tcPr>
-            <w:tcW w:type="dxa" w:w="2100"/>
+              <w:t xml:space="preserve">% ident</w:t>
+            </w:r>
+          </w:p>
+        </w:tc>
+        <w:tc>
+          <w:tcPr>
+            <w:tcW w:type="dxa" w:w="980"/>
             <w:tcBorders>
               <w:top w:val="single" w:color="CCCCCC" w:sz="1"/>
               <w:left w:val="single" w:color="CCCCCC" w:sz="1"/>
@@ -384,7 +375,37 @@
                 <w:sz w:val="19"/>
                 <w:szCs w:val="19"/>
               </w:rPr>
-              <w:t xml:space="preserve">E-value / coverage (your run)</w:t>
+              <w:t xml:space="preserve">E-value</w:t>
+            </w:r>
+          </w:p>
+        </w:tc>
+        <w:tc>
+          <w:tcPr>
+            <w:tcW w:type="dxa" w:w="1340"/>
+            <w:tcBorders>
+              <w:top w:val="single" w:color="CCCCCC" w:sz="1"/>
+              <w:left w:val="single" w:color="CCCCCC" w:sz="1"/>
+              <w:bottom w:val="single" w:color="CCCCCC" w:sz="1"/>
+              <w:right w:val="single" w:color="CCCCCC" w:sz="1"/>
+            </w:tcBorders>
+            <w:shd w:fill="2E5A87" w:val="clear"/>
+            <w:tcMar>
+              <w:top w:type="dxa" w:w="80"/>
+              <w:left w:type="dxa" w:w="120"/>
+              <w:bottom w:type="dxa" w:w="80"/>
+              <w:right w:type="dxa" w:w="120"/>
+            </w:tcMar>
+          </w:tcPr>
+          <w:p>
+            <w:r>
+              <w:rPr>
+                <w:b/>
+                <w:bCs/>
+                <w:color w:val="FFFFFF"/>
+                <w:sz w:val="19"/>
+                <w:szCs w:val="19"/>
+              </w:rPr>
+              <w:t xml:space="preserve">Q. cover</w:t>
             </w:r>
           </w:p>
         </w:tc>
@@ -392,59 +413,59 @@
       <w:tr>
         <w:tc>
           <w:tcPr>
-            <w:tcW w:type="dxa" w:w="3300"/>
-            <w:tcBorders>
-              <w:top w:val="single" w:color="CCCCCC" w:sz="1"/>
-              <w:left w:val="single" w:color="CCCCCC" w:sz="1"/>
-              <w:bottom w:val="single" w:color="CCCCCC" w:sz="1"/>
-              <w:right w:val="single" w:color="CCCCCC" w:sz="1"/>
-            </w:tcBorders>
-            <w:tcMar>
-              <w:top w:type="dxa" w:w="70"/>
-              <w:left w:type="dxa" w:w="120"/>
-              <w:bottom w:type="dxa" w:w="70"/>
-              <w:right w:type="dxa" w:w="120"/>
-            </w:tcMar>
-          </w:tcPr>
-          <w:p>
-            <w:r>
-              <w:rPr>
-                <w:sz w:val="19"/>
-                <w:szCs w:val="19"/>
-              </w:rPr>
-              <w:t xml:space="preserve">TEM-1 β-lactamase / blaTEM-1</w:t>
-            </w:r>
-          </w:p>
-        </w:tc>
-        <w:tc>
-          <w:tcPr>
-            <w:tcW w:type="dxa" w:w="2660"/>
-            <w:tcBorders>
-              <w:top w:val="single" w:color="CCCCCC" w:sz="1"/>
-              <w:left w:val="single" w:color="CCCCCC" w:sz="1"/>
-              <w:bottom w:val="single" w:color="CCCCCC" w:sz="1"/>
-              <w:right w:val="single" w:color="CCCCCC" w:sz="1"/>
-            </w:tcBorders>
-            <w:tcMar>
-              <w:top w:type="dxa" w:w="70"/>
-              <w:left w:type="dxa" w:w="120"/>
-              <w:bottom w:type="dxa" w:w="70"/>
-              <w:right w:type="dxa" w:w="120"/>
-            </w:tcMar>
-          </w:tcPr>
-          <w:p>
-            <w:r>
-              <w:rPr>
-                <w:sz w:val="19"/>
-                <w:szCs w:val="19"/>
-              </w:rPr>
-              <w:t xml:space="preserve">Escherichia coli</w:t>
-            </w:r>
-          </w:p>
-        </w:tc>
-        <w:tc>
-          <w:tcPr>
-            <w:tcW w:type="dxa" w:w="1300"/>
+            <w:tcW w:type="dxa" w:w="3560"/>
+            <w:tcBorders>
+              <w:top w:val="single" w:color="CCCCCC" w:sz="1"/>
+              <w:left w:val="single" w:color="CCCCCC" w:sz="1"/>
+              <w:bottom w:val="single" w:color="CCCCCC" w:sz="1"/>
+              <w:right w:val="single" w:color="CCCCCC" w:sz="1"/>
+            </w:tcBorders>
+            <w:tcMar>
+              <w:top w:type="dxa" w:w="70"/>
+              <w:left w:type="dxa" w:w="120"/>
+              <w:bottom w:type="dxa" w:w="70"/>
+              <w:right w:type="dxa" w:w="120"/>
+            </w:tcMar>
+          </w:tcPr>
+          <w:p>
+            <w:r>
+              <w:rPr>
+                <w:sz w:val="19"/>
+                <w:szCs w:val="19"/>
+              </w:rPr>
+              <w:t xml:space="preserve">TEM-1, partial (APX42443)</w:t>
+            </w:r>
+          </w:p>
+        </w:tc>
+        <w:tc>
+          <w:tcPr>
+            <w:tcW w:type="dxa" w:w="2400"/>
+            <w:tcBorders>
+              <w:top w:val="single" w:color="CCCCCC" w:sz="1"/>
+              <w:left w:val="single" w:color="CCCCCC" w:sz="1"/>
+              <w:bottom w:val="single" w:color="CCCCCC" w:sz="1"/>
+              <w:right w:val="single" w:color="CCCCCC" w:sz="1"/>
+            </w:tcBorders>
+            <w:tcMar>
+              <w:top w:type="dxa" w:w="70"/>
+              <w:left w:type="dxa" w:w="120"/>
+              <w:bottom w:type="dxa" w:w="70"/>
+              <w:right w:type="dxa" w:w="120"/>
+            </w:tcMar>
+          </w:tcPr>
+          <w:p>
+            <w:r>
+              <w:rPr>
+                <w:sz w:val="19"/>
+                <w:szCs w:val="19"/>
+              </w:rPr>
+              <w:t xml:space="preserve">Acinetobacter baumannii</w:t>
+            </w:r>
+          </w:p>
+        </w:tc>
+        <w:tc>
+          <w:tcPr>
+            <w:tcW w:type="dxa" w:w="1080"/>
             <w:tcBorders>
               <w:top w:val="single" w:color="CCCCCC" w:sz="1"/>
               <w:left w:val="single" w:color="CCCCCC" w:sz="1"/>
@@ -470,27 +491,53 @@
         </w:tc>
         <w:tc>
           <w:tcPr>
-            <w:tcW w:type="dxa" w:w="2100"/>
-            <w:tcBorders>
-              <w:top w:val="single" w:color="CCCCCC" w:sz="1"/>
-              <w:left w:val="single" w:color="CCCCCC" w:sz="1"/>
-              <w:bottom w:val="single" w:color="CCCCCC" w:sz="1"/>
-              <w:right w:val="single" w:color="CCCCCC" w:sz="1"/>
-            </w:tcBorders>
-            <w:tcMar>
-              <w:top w:type="dxa" w:w="70"/>
-              <w:left w:type="dxa" w:w="120"/>
-              <w:bottom w:type="dxa" w:w="70"/>
-              <w:right w:type="dxa" w:w="120"/>
-            </w:tcMar>
-          </w:tcPr>
-          <w:p>
-            <w:r>
-              <w:rPr>
-                <w:sz w:val="19"/>
-                <w:szCs w:val="19"/>
-              </w:rPr>
-              <w:t xml:space="preserve">_____ / _____</w:t>
+            <w:tcW w:type="dxa" w:w="980"/>
+            <w:tcBorders>
+              <w:top w:val="single" w:color="CCCCCC" w:sz="1"/>
+              <w:left w:val="single" w:color="CCCCCC" w:sz="1"/>
+              <w:bottom w:val="single" w:color="CCCCCC" w:sz="1"/>
+              <w:right w:val="single" w:color="CCCCCC" w:sz="1"/>
+            </w:tcBorders>
+            <w:tcMar>
+              <w:top w:type="dxa" w:w="70"/>
+              <w:left w:type="dxa" w:w="120"/>
+              <w:bottom w:type="dxa" w:w="70"/>
+              <w:right w:type="dxa" w:w="120"/>
+            </w:tcMar>
+          </w:tcPr>
+          <w:p>
+            <w:r>
+              <w:rPr>
+                <w:sz w:val="19"/>
+                <w:szCs w:val="19"/>
+              </w:rPr>
+              <w:t xml:space="preserve">0.0</w:t>
+            </w:r>
+          </w:p>
+        </w:tc>
+        <w:tc>
+          <w:tcPr>
+            <w:tcW w:type="dxa" w:w="1340"/>
+            <w:tcBorders>
+              <w:top w:val="single" w:color="CCCCCC" w:sz="1"/>
+              <w:left w:val="single" w:color="CCCCCC" w:sz="1"/>
+              <w:bottom w:val="single" w:color="CCCCCC" w:sz="1"/>
+              <w:right w:val="single" w:color="CCCCCC" w:sz="1"/>
+            </w:tcBorders>
+            <w:tcMar>
+              <w:top w:type="dxa" w:w="70"/>
+              <w:left w:type="dxa" w:w="120"/>
+              <w:bottom w:type="dxa" w:w="70"/>
+              <w:right w:type="dxa" w:w="120"/>
+            </w:tcMar>
+          </w:tcPr>
+          <w:p>
+            <w:r>
+              <w:rPr>
+                <w:sz w:val="19"/>
+                <w:szCs w:val="19"/>
+              </w:rPr>
+              <w:t xml:space="preserve">100 %</w:t>
             </w:r>
           </w:p>
         </w:tc>
@@ -498,7 +545,7 @@
       <w:tr>
         <w:tc>
           <w:tcPr>
-            <w:tcW w:type="dxa" w:w="3300"/>
+            <w:tcW w:type="dxa" w:w="3560"/>
             <w:tcBorders>
               <w:top w:val="single" w:color="CCCCCC" w:sz="1"/>
               <w:left w:val="single" w:color="CCCCCC" w:sz="1"/>
@@ -519,13 +566,13 @@
                 <w:sz w:val="19"/>
                 <w:szCs w:val="19"/>
               </w:rPr>
-              <w:t xml:space="preserve">TEM-type β-lactamase (variants)</w:t>
-            </w:r>
-          </w:p>
-        </w:tc>
-        <w:tc>
-          <w:tcPr>
-            <w:tcW w:type="dxa" w:w="2660"/>
+              <w:t xml:space="preserve">TEM family class A β-lactamase (WP_218377321; 129 organisms)</w:t>
+            </w:r>
+          </w:p>
+        </w:tc>
+        <w:tc>
+          <w:tcPr>
+            <w:tcW w:type="dxa" w:w="2400"/>
             <w:tcBorders>
               <w:top w:val="single" w:color="CCCCCC" w:sz="1"/>
               <w:left w:val="single" w:color="CCCCCC" w:sz="1"/>
@@ -546,13 +593,13 @@
                 <w:sz w:val="19"/>
                 <w:szCs w:val="19"/>
               </w:rPr>
-              <w:t xml:space="preserve">Klebsiella, Salmonella, Shigella, Enterobacter…</w:t>
-            </w:r>
-          </w:p>
-        </w:tc>
-        <w:tc>
-          <w:tcPr>
-            <w:tcW w:type="dxa" w:w="1300"/>
+              <w:t xml:space="preserve">Klebsiella pneumoniae</w:t>
+            </w:r>
+          </w:p>
+        </w:tc>
+        <w:tc>
+          <w:tcPr>
+            <w:tcW w:type="dxa" w:w="1080"/>
             <w:tcBorders>
               <w:top w:val="single" w:color="CCCCCC" w:sz="1"/>
               <w:left w:val="single" w:color="CCCCCC" w:sz="1"/>
@@ -573,13 +620,13 @@
                 <w:sz w:val="19"/>
                 <w:szCs w:val="19"/>
               </w:rPr>
-              <w:t xml:space="preserve">≈100 %</w:t>
-            </w:r>
-          </w:p>
-        </w:tc>
-        <w:tc>
-          <w:tcPr>
-            <w:tcW w:type="dxa" w:w="2100"/>
+              <w:t xml:space="preserve">99.65 %</w:t>
+            </w:r>
+          </w:p>
+        </w:tc>
+        <w:tc>
+          <w:tcPr>
+            <w:tcW w:type="dxa" w:w="980"/>
             <w:tcBorders>
               <w:top w:val="single" w:color="CCCCCC" w:sz="1"/>
               <w:left w:val="single" w:color="CCCCCC" w:sz="1"/>
@@ -600,7 +647,34 @@
                 <w:sz w:val="19"/>
                 <w:szCs w:val="19"/>
               </w:rPr>
-              <w:t xml:space="preserve">_____ / _____</w:t>
+              <w:t xml:space="preserve">0.0</w:t>
+            </w:r>
+          </w:p>
+        </w:tc>
+        <w:tc>
+          <w:tcPr>
+            <w:tcW w:type="dxa" w:w="1340"/>
+            <w:tcBorders>
+              <w:top w:val="single" w:color="CCCCCC" w:sz="1"/>
+              <w:left w:val="single" w:color="CCCCCC" w:sz="1"/>
+              <w:bottom w:val="single" w:color="CCCCCC" w:sz="1"/>
+              <w:right w:val="single" w:color="CCCCCC" w:sz="1"/>
+            </w:tcBorders>
+            <w:shd w:fill="EAF1F7" w:val="clear"/>
+            <w:tcMar>
+              <w:top w:type="dxa" w:w="70"/>
+              <w:left w:type="dxa" w:w="120"/>
+              <w:bottom w:type="dxa" w:w="70"/>
+              <w:right w:type="dxa" w:w="120"/>
+            </w:tcMar>
+          </w:tcPr>
+          <w:p>
+            <w:r>
+              <w:rPr>
+                <w:sz w:val="19"/>
+                <w:szCs w:val="19"/>
+              </w:rPr>
+              <w:t xml:space="preserve">100 %</w:t>
             </w:r>
           </w:p>
         </w:tc>
@@ -608,105 +682,131 @@
       <w:tr>
         <w:tc>
           <w:tcPr>
-            <w:tcW w:type="dxa" w:w="3300"/>
-            <w:tcBorders>
-              <w:top w:val="single" w:color="CCCCCC" w:sz="1"/>
-              <w:left w:val="single" w:color="CCCCCC" w:sz="1"/>
-              <w:bottom w:val="single" w:color="CCCCCC" w:sz="1"/>
-              <w:right w:val="single" w:color="CCCCCC" w:sz="1"/>
-            </w:tcBorders>
-            <w:tcMar>
-              <w:top w:type="dxa" w:w="70"/>
-              <w:left w:type="dxa" w:w="120"/>
-              <w:bottom w:type="dxa" w:w="70"/>
-              <w:right w:type="dxa" w:w="120"/>
-            </w:tcMar>
-          </w:tcPr>
-          <w:p>
-            <w:r>
-              <w:rPr>
-                <w:sz w:val="19"/>
-                <w:szCs w:val="19"/>
-              </w:rPr>
-              <w:t xml:space="preserve">TEM-2 / ESBL TEM variants</w:t>
-            </w:r>
-          </w:p>
-        </w:tc>
-        <w:tc>
-          <w:tcPr>
-            <w:tcW w:type="dxa" w:w="2660"/>
-            <w:tcBorders>
-              <w:top w:val="single" w:color="CCCCCC" w:sz="1"/>
-              <w:left w:val="single" w:color="CCCCCC" w:sz="1"/>
-              <w:bottom w:val="single" w:color="CCCCCC" w:sz="1"/>
-              <w:right w:val="single" w:color="CCCCCC" w:sz="1"/>
-            </w:tcBorders>
-            <w:tcMar>
-              <w:top w:type="dxa" w:w="70"/>
-              <w:left w:type="dxa" w:w="120"/>
-              <w:bottom w:type="dxa" w:w="70"/>
-              <w:right w:type="dxa" w:w="120"/>
-            </w:tcMar>
-          </w:tcPr>
-          <w:p>
-            <w:r>
-              <w:rPr>
-                <w:sz w:val="19"/>
-                <w:szCs w:val="19"/>
-              </w:rPr>
-              <w:t xml:space="preserve">Enterobacterales</w:t>
-            </w:r>
-          </w:p>
-        </w:tc>
-        <w:tc>
-          <w:tcPr>
-            <w:tcW w:type="dxa" w:w="1300"/>
-            <w:tcBorders>
-              <w:top w:val="single" w:color="CCCCCC" w:sz="1"/>
-              <w:left w:val="single" w:color="CCCCCC" w:sz="1"/>
-              <w:bottom w:val="single" w:color="CCCCCC" w:sz="1"/>
-              <w:right w:val="single" w:color="CCCCCC" w:sz="1"/>
-            </w:tcBorders>
-            <w:tcMar>
-              <w:top w:type="dxa" w:w="70"/>
-              <w:left w:type="dxa" w:w="120"/>
-              <w:bottom w:type="dxa" w:w="70"/>
-              <w:right w:type="dxa" w:w="120"/>
-            </w:tcMar>
-          </w:tcPr>
-          <w:p>
-            <w:r>
-              <w:rPr>
-                <w:sz w:val="19"/>
-                <w:szCs w:val="19"/>
-              </w:rPr>
-              <w:t xml:space="preserve">99–100 %</w:t>
-            </w:r>
-          </w:p>
-        </w:tc>
-        <w:tc>
-          <w:tcPr>
-            <w:tcW w:type="dxa" w:w="2100"/>
-            <w:tcBorders>
-              <w:top w:val="single" w:color="CCCCCC" w:sz="1"/>
-              <w:left w:val="single" w:color="CCCCCC" w:sz="1"/>
-              <w:bottom w:val="single" w:color="CCCCCC" w:sz="1"/>
-              <w:right w:val="single" w:color="CCCCCC" w:sz="1"/>
-            </w:tcBorders>
-            <w:tcMar>
-              <w:top w:type="dxa" w:w="70"/>
-              <w:left w:type="dxa" w:w="120"/>
-              <w:bottom w:type="dxa" w:w="70"/>
-              <w:right w:type="dxa" w:w="120"/>
-            </w:tcMar>
-          </w:tcPr>
-          <w:p>
-            <w:r>
-              <w:rPr>
-                <w:sz w:val="19"/>
-                <w:szCs w:val="19"/>
-              </w:rPr>
-              <w:t xml:space="preserve">_____ / _____</w:t>
+            <w:tcW w:type="dxa" w:w="3560"/>
+            <w:tcBorders>
+              <w:top w:val="single" w:color="CCCCCC" w:sz="1"/>
+              <w:left w:val="single" w:color="CCCCCC" w:sz="1"/>
+              <w:bottom w:val="single" w:color="CCCCCC" w:sz="1"/>
+              <w:right w:val="single" w:color="CCCCCC" w:sz="1"/>
+            </w:tcBorders>
+            <w:tcMar>
+              <w:top w:type="dxa" w:w="70"/>
+              <w:left w:type="dxa" w:w="120"/>
+              <w:bottom w:type="dxa" w:w="70"/>
+              <w:right w:type="dxa" w:w="120"/>
+            </w:tcMar>
+          </w:tcPr>
+          <w:p>
+            <w:r>
+              <w:rPr>
+                <w:sz w:val="19"/>
+                <w:szCs w:val="19"/>
+              </w:rPr>
+              <w:t xml:space="preserve">class A β-lactamase TEM-166 (WP_063864874)</w:t>
+            </w:r>
+          </w:p>
+        </w:tc>
+        <w:tc>
+          <w:tcPr>
+            <w:tcW w:type="dxa" w:w="2400"/>
+            <w:tcBorders>
+              <w:top w:val="single" w:color="CCCCCC" w:sz="1"/>
+              <w:left w:val="single" w:color="CCCCCC" w:sz="1"/>
+              <w:bottom w:val="single" w:color="CCCCCC" w:sz="1"/>
+              <w:right w:val="single" w:color="CCCCCC" w:sz="1"/>
+            </w:tcBorders>
+            <w:tcMar>
+              <w:top w:type="dxa" w:w="70"/>
+              <w:left w:type="dxa" w:w="120"/>
+              <w:bottom w:type="dxa" w:w="70"/>
+              <w:right w:type="dxa" w:w="120"/>
+            </w:tcMar>
+          </w:tcPr>
+          <w:p>
+            <w:r>
+              <w:rPr>
+                <w:sz w:val="19"/>
+                <w:szCs w:val="19"/>
+              </w:rPr>
+              <w:t xml:space="preserve">Escherichia coli</w:t>
+            </w:r>
+          </w:p>
+        </w:tc>
+        <w:tc>
+          <w:tcPr>
+            <w:tcW w:type="dxa" w:w="1080"/>
+            <w:tcBorders>
+              <w:top w:val="single" w:color="CCCCCC" w:sz="1"/>
+              <w:left w:val="single" w:color="CCCCCC" w:sz="1"/>
+              <w:bottom w:val="single" w:color="CCCCCC" w:sz="1"/>
+              <w:right w:val="single" w:color="CCCCCC" w:sz="1"/>
+            </w:tcBorders>
+            <w:tcMar>
+              <w:top w:type="dxa" w:w="70"/>
+              <w:left w:type="dxa" w:w="120"/>
+              <w:bottom w:type="dxa" w:w="70"/>
+              <w:right w:type="dxa" w:w="120"/>
+            </w:tcMar>
+          </w:tcPr>
+          <w:p>
+            <w:r>
+              <w:rPr>
+                <w:sz w:val="19"/>
+                <w:szCs w:val="19"/>
+              </w:rPr>
+              <w:t xml:space="preserve">99.65 %</w:t>
+            </w:r>
+          </w:p>
+        </w:tc>
+        <w:tc>
+          <w:tcPr>
+            <w:tcW w:type="dxa" w:w="980"/>
+            <w:tcBorders>
+              <w:top w:val="single" w:color="CCCCCC" w:sz="1"/>
+              <w:left w:val="single" w:color="CCCCCC" w:sz="1"/>
+              <w:bottom w:val="single" w:color="CCCCCC" w:sz="1"/>
+              <w:right w:val="single" w:color="CCCCCC" w:sz="1"/>
+            </w:tcBorders>
+            <w:tcMar>
+              <w:top w:type="dxa" w:w="70"/>
+              <w:left w:type="dxa" w:w="120"/>
+              <w:bottom w:type="dxa" w:w="70"/>
+              <w:right w:type="dxa" w:w="120"/>
+            </w:tcMar>
+          </w:tcPr>
+          <w:p>
+            <w:r>
+              <w:rPr>
+                <w:sz w:val="19"/>
+                <w:szCs w:val="19"/>
+              </w:rPr>
+              <w:t xml:space="preserve">0.0</w:t>
+            </w:r>
+          </w:p>
+        </w:tc>
+        <w:tc>
+          <w:tcPr>
+            <w:tcW w:type="dxa" w:w="1340"/>
+            <w:tcBorders>
+              <w:top w:val="single" w:color="CCCCCC" w:sz="1"/>
+              <w:left w:val="single" w:color="CCCCCC" w:sz="1"/>
+              <w:bottom w:val="single" w:color="CCCCCC" w:sz="1"/>
+              <w:right w:val="single" w:color="CCCCCC" w:sz="1"/>
+            </w:tcBorders>
+            <w:tcMar>
+              <w:top w:type="dxa" w:w="70"/>
+              <w:left w:type="dxa" w:w="120"/>
+              <w:bottom w:type="dxa" w:w="70"/>
+              <w:right w:type="dxa" w:w="120"/>
+            </w:tcMar>
+          </w:tcPr>
+          <w:p>
+            <w:r>
+              <w:rPr>
+                <w:sz w:val="19"/>
+                <w:szCs w:val="19"/>
+              </w:rPr>
+              <w:t xml:space="preserve">100 %</w:t>
             </w:r>
           </w:p>
         </w:tc>
@@ -714,7 +814,7 @@
       <w:tr>
         <w:tc>
           <w:tcPr>
-            <w:tcW w:type="dxa" w:w="3300"/>
+            <w:tcW w:type="dxa" w:w="3560"/>
             <w:tcBorders>
               <w:top w:val="single" w:color="CCCCCC" w:sz="1"/>
               <w:left w:val="single" w:color="CCCCCC" w:sz="1"/>
@@ -735,13 +835,13 @@
                 <w:sz w:val="19"/>
                 <w:szCs w:val="19"/>
               </w:rPr>
-              <w:t xml:space="preserve">SHV-1 β-lactamase</w:t>
-            </w:r>
-          </w:p>
-        </w:tc>
-        <w:tc>
-          <w:tcPr>
-            <w:tcW w:type="dxa" w:w="2660"/>
+              <w:t xml:space="preserve">ESBL class A β-lactamase TEM-21 (WP_063864899; 73 organisms)</w:t>
+            </w:r>
+          </w:p>
+        </w:tc>
+        <w:tc>
+          <w:tcPr>
+            <w:tcW w:type="dxa" w:w="2400"/>
             <w:tcBorders>
               <w:top w:val="single" w:color="CCCCCC" w:sz="1"/>
               <w:left w:val="single" w:color="CCCCCC" w:sz="1"/>
@@ -762,13 +862,13 @@
                 <w:sz w:val="19"/>
                 <w:szCs w:val="19"/>
               </w:rPr>
-              <w:t xml:space="preserve">Klebsiella pneumoniae</w:t>
-            </w:r>
-          </w:p>
-        </w:tc>
-        <w:tc>
-          <w:tcPr>
-            <w:tcW w:type="dxa" w:w="1300"/>
+              <w:t xml:space="preserve">Gammaproteobacteria (multispecies)</w:t>
+            </w:r>
+          </w:p>
+        </w:tc>
+        <w:tc>
+          <w:tcPr>
+            <w:tcW w:type="dxa" w:w="1080"/>
             <w:tcBorders>
               <w:top w:val="single" w:color="CCCCCC" w:sz="1"/>
               <w:left w:val="single" w:color="CCCCCC" w:sz="1"/>
@@ -789,13 +889,13 @@
                 <w:sz w:val="19"/>
                 <w:szCs w:val="19"/>
               </w:rPr>
-              <w:t xml:space="preserve">≈65 %</w:t>
-            </w:r>
-          </w:p>
-        </w:tc>
-        <w:tc>
-          <w:tcPr>
-            <w:tcW w:type="dxa" w:w="2100"/>
+              <w:t xml:space="preserve">98.60 %</w:t>
+            </w:r>
+          </w:p>
+        </w:tc>
+        <w:tc>
+          <w:tcPr>
+            <w:tcW w:type="dxa" w:w="980"/>
             <w:tcBorders>
               <w:top w:val="single" w:color="CCCCCC" w:sz="1"/>
               <w:left w:val="single" w:color="CCCCCC" w:sz="1"/>
@@ -816,7 +916,166 @@
                 <w:sz w:val="19"/>
                 <w:szCs w:val="19"/>
               </w:rPr>
-              <w:t xml:space="preserve">_____ / _____</w:t>
+              <w:t xml:space="preserve">0.0</w:t>
+            </w:r>
+          </w:p>
+        </w:tc>
+        <w:tc>
+          <w:tcPr>
+            <w:tcW w:type="dxa" w:w="1340"/>
+            <w:tcBorders>
+              <w:top w:val="single" w:color="CCCCCC" w:sz="1"/>
+              <w:left w:val="single" w:color="CCCCCC" w:sz="1"/>
+              <w:bottom w:val="single" w:color="CCCCCC" w:sz="1"/>
+              <w:right w:val="single" w:color="CCCCCC" w:sz="1"/>
+            </w:tcBorders>
+            <w:shd w:fill="EAF1F7" w:val="clear"/>
+            <w:tcMar>
+              <w:top w:type="dxa" w:w="70"/>
+              <w:left w:type="dxa" w:w="120"/>
+              <w:bottom w:type="dxa" w:w="70"/>
+              <w:right w:type="dxa" w:w="120"/>
+            </w:tcMar>
+          </w:tcPr>
+          <w:p>
+            <w:r>
+              <w:rPr>
+                <w:sz w:val="19"/>
+                <w:szCs w:val="19"/>
+              </w:rPr>
+              <w:t xml:space="preserve">100 %</w:t>
+            </w:r>
+          </w:p>
+        </w:tc>
+      </w:tr>
+      <w:tr>
+        <w:tc>
+          <w:tcPr>
+            <w:tcW w:type="dxa" w:w="3560"/>
+            <w:tcBorders>
+              <w:top w:val="single" w:color="CCCCCC" w:sz="1"/>
+              <w:left w:val="single" w:color="CCCCCC" w:sz="1"/>
+              <w:bottom w:val="single" w:color="CCCCCC" w:sz="1"/>
+              <w:right w:val="single" w:color="CCCCCC" w:sz="1"/>
+            </w:tcBorders>
+            <w:tcMar>
+              <w:top w:type="dxa" w:w="70"/>
+              <w:left w:type="dxa" w:w="120"/>
+              <w:bottom w:type="dxa" w:w="70"/>
+              <w:right w:type="dxa" w:w="120"/>
+            </w:tcMar>
+          </w:tcPr>
+          <w:p>
+            <w:r>
+              <w:rPr>
+                <w:sz w:val="19"/>
+                <w:szCs w:val="19"/>
+              </w:rPr>
+              <w:t xml:space="preserve">TEM family β-lactamase (WP_284671817; 52 organisms)</w:t>
+            </w:r>
+          </w:p>
+        </w:tc>
+        <w:tc>
+          <w:tcPr>
+            <w:tcW w:type="dxa" w:w="2400"/>
+            <w:tcBorders>
+              <w:top w:val="single" w:color="CCCCCC" w:sz="1"/>
+              <w:left w:val="single" w:color="CCCCCC" w:sz="1"/>
+              <w:bottom w:val="single" w:color="CCCCCC" w:sz="1"/>
+              <w:right w:val="single" w:color="CCCCCC" w:sz="1"/>
+            </w:tcBorders>
+            <w:tcMar>
+              <w:top w:type="dxa" w:w="70"/>
+              <w:left w:type="dxa" w:w="120"/>
+              <w:bottom w:type="dxa" w:w="70"/>
+              <w:right w:type="dxa" w:w="120"/>
+            </w:tcMar>
+          </w:tcPr>
+          <w:p>
+            <w:r>
+              <w:rPr>
+                <w:sz w:val="19"/>
+                <w:szCs w:val="19"/>
+              </w:rPr>
+              <w:t xml:space="preserve">Morganella morganii</w:t>
+            </w:r>
+          </w:p>
+        </w:tc>
+        <w:tc>
+          <w:tcPr>
+            <w:tcW w:type="dxa" w:w="1080"/>
+            <w:tcBorders>
+              <w:top w:val="single" w:color="CCCCCC" w:sz="1"/>
+              <w:left w:val="single" w:color="CCCCCC" w:sz="1"/>
+              <w:bottom w:val="single" w:color="CCCCCC" w:sz="1"/>
+              <w:right w:val="single" w:color="CCCCCC" w:sz="1"/>
+            </w:tcBorders>
+            <w:tcMar>
+              <w:top w:type="dxa" w:w="70"/>
+              <w:left w:type="dxa" w:w="120"/>
+              <w:bottom w:type="dxa" w:w="70"/>
+              <w:right w:type="dxa" w:w="120"/>
+            </w:tcMar>
+          </w:tcPr>
+          <w:p>
+            <w:r>
+              <w:rPr>
+                <w:sz w:val="19"/>
+                <w:szCs w:val="19"/>
+              </w:rPr>
+              <w:t xml:space="preserve">100 %</w:t>
+            </w:r>
+          </w:p>
+        </w:tc>
+        <w:tc>
+          <w:tcPr>
+            <w:tcW w:type="dxa" w:w="980"/>
+            <w:tcBorders>
+              <w:top w:val="single" w:color="CCCCCC" w:sz="1"/>
+              <w:left w:val="single" w:color="CCCCCC" w:sz="1"/>
+              <w:bottom w:val="single" w:color="CCCCCC" w:sz="1"/>
+              <w:right w:val="single" w:color="CCCCCC" w:sz="1"/>
+            </w:tcBorders>
+            <w:tcMar>
+              <w:top w:type="dxa" w:w="70"/>
+              <w:left w:type="dxa" w:w="120"/>
+              <w:bottom w:type="dxa" w:w="70"/>
+              <w:right w:type="dxa" w:w="120"/>
+            </w:tcMar>
+          </w:tcPr>
+          <w:p>
+            <w:r>
+              <w:rPr>
+                <w:sz w:val="19"/>
+                <w:szCs w:val="19"/>
+              </w:rPr>
+              <w:t xml:space="preserve">0.0</w:t>
+            </w:r>
+          </w:p>
+        </w:tc>
+        <w:tc>
+          <w:tcPr>
+            <w:tcW w:type="dxa" w:w="1340"/>
+            <w:tcBorders>
+              <w:top w:val="single" w:color="CCCCCC" w:sz="1"/>
+              <w:left w:val="single" w:color="CCCCCC" w:sz="1"/>
+              <w:bottom w:val="single" w:color="CCCCCC" w:sz="1"/>
+              <w:right w:val="single" w:color="CCCCCC" w:sz="1"/>
+            </w:tcBorders>
+            <w:tcMar>
+              <w:top w:type="dxa" w:w="70"/>
+              <w:left w:type="dxa" w:w="120"/>
+              <w:bottom w:type="dxa" w:w="70"/>
+              <w:right w:type="dxa" w:w="120"/>
+            </w:tcMar>
+          </w:tcPr>
+          <w:p>
+            <w:r>
+              <w:rPr>
+                <w:sz w:val="19"/>
+                <w:szCs w:val="19"/>
+              </w:rPr>
+              <w:t xml:space="preserve">99 %</w:t>
             </w:r>
           </w:p>
         </w:tc>
@@ -834,7 +1093,17 @@
         <w:t xml:space="preserve">Do the top hits come from the same organism? </w:t>
       </w:r>
       <w:r>
-        <w:t xml:space="preserve">No. Near-identical hits appear across many </w:t>
+        <w:t xml:space="preserve">No. Near-identical hits (</w:t>
+      </w:r>
+      <w:r>
+        <w:rPr>
+          <w:b/>
+          <w:bCs/>
+        </w:rPr>
+        <w:t xml:space="preserve">E-value 0.0, ~98–100 % identity, full coverage</w:t>
+      </w:r>
+      <w:r>
+        <w:t xml:space="preserve">) span many </w:t>
       </w:r>
       <w:r>
         <w:rPr>
@@ -844,17 +1113,17 @@
         <w:t xml:space="preserve">different</w:t>
       </w:r>
       <w:r>
-        <w:t xml:space="preserve"> Gram-negative genera (</w:t>
+        <w:t xml:space="preserve"> Gram-negative genera — </w:t>
       </w:r>
       <w:r>
         <w:rPr>
           <w:i/>
           <w:iCs/>
         </w:rPr>
-        <w:t xml:space="preserve">E. coli, Klebsiella, Salmonella, Shigella</w:t>
-      </w:r>
-      <w:r>
-        <w:t xml:space="preserve">…). </w:t>
+        <w:t xml:space="preserve">Acinetobacter, Klebsiella, Escherichia, Morganella, Providencia, Enterobacter</w:t>
+      </w:r>
+      <w:r>
+        <w:t xml:space="preserve">… — and several hits represent dozens to hundreds of organisms at once. </w:t>
       </w:r>
       <w:r>
         <w:rPr>
@@ -874,17 +1143,52 @@
         <w:t xml:space="preserve">mobile gene</w:t>
       </w:r>
       <w:r>
-        <w:t xml:space="preserve"> — carried on plasmids and the Tn3 transposon and disseminated by horizontal gene transfer rather than vertical inheritance. The fact that the protein stays almost invariant across hosts reflects strong selection by β-lactam antibiotics: the sequence is </w:t>
-      </w:r>
-      <w:r>
-        <w:rPr>
-          <w:b/>
-          <w:bCs/>
-        </w:rPr>
-        <w:t xml:space="preserve">highly conserved</w:t>
-      </w:r>
-      <w:r>
-        <w:t xml:space="preserve"> because its catalytic machinery cannot drift without losing the resistance phenotype.</w:t>
+        <w:t xml:space="preserve"> spread by plasmids and the Tn3 transposon via horizontal transfer, kept almost invariant across hosts by β-lactam selective pressure. Named variants among the hits (TEM-21, TEM-88, TEM-166, TEM-232…) directly trace the TEM-1 → extended-spectrum evolutionary radiation.</w:t>
+      </w:r>
+    </w:p>
+    <w:p>
+      <w:pPr>
+        <w:spacing w:after="140" w:line="276"/>
+      </w:pPr>
+      <w:r>
+        <w:rPr>
+          <w:b/>
+          <w:bCs/>
+        </w:rPr>
+        <w:t xml:space="preserve">Two reading caveats worth noting. </w:t>
+      </w:r>
+      <w:r>
+        <w:t xml:space="preserve">(i) The very top of the ClusteredNR list is dominated by </w:t>
+      </w:r>
+      <w:r>
+        <w:rPr>
+          <w:b/>
+          <w:bCs/>
+        </w:rPr>
+        <w:t xml:space="preserve">engineered constructs</w:t>
+      </w:r>
+      <w:r>
+        <w:t xml:space="preserve"> (cloning vector pCVD004, a β-lactamase–IgG3 fusion, an ESBL–aminoglycoside fusion) because blaTEM is the most common laboratory selection marker — not biological homologs. (ii) One hit (XP_013335878) is annotated to </w:t>
+      </w:r>
+      <w:r>
+        <w:rPr>
+          <w:i/>
+          <w:iCs/>
+        </w:rPr>
+        <w:t xml:space="preserve">Eimeria maxima</w:t>
+      </w:r>
+      <w:r>
+        <w:t xml:space="preserve">, an apicomplexan parasite; a bacterial β-lactamase at 99 % identity in a eukaryotic parasite is almost certainly a </w:t>
+      </w:r>
+      <w:r>
+        <w:rPr>
+          <w:b/>
+          <w:bCs/>
+        </w:rPr>
+        <w:t xml:space="preserve">database-contamination artifact</w:t>
+      </w:r>
+      <w:r>
+        <w:t xml:space="preserve">, not a real ortholog.</w:t>
       </w:r>
     </w:p>
     <w:p>
@@ -2831,7 +3135,7 @@
         <w:t xml:space="preserve">Method. </w:t>
       </w:r>
       <w:r>
-        <w:t xml:space="preserve">MSA built with FAMSA; 293 alignment columns, 5 sequences. </w:t>
+        <w:t xml:space="preserve">MSA of the five homologs (MAFFT in the Galaxy run; the figure below is from an equivalent FAMSA alignment — conserved catalytic columns are aligner-independent). </w:t>
       </w:r>
       <w:r>
         <w:rPr>
@@ -2996,7 +3300,50 @@
         <w:t xml:space="preserve">Method. </w:t>
       </w:r>
       <w:r>
-        <w:t xml:space="preserve">Neighbour-joining tree from BLOSUM62 pairwise distances on the FAMSA alignment, rooted on the Gram-positive BlaZ outgroup.</w:t>
+        <w:t xml:space="preserve">Tree inferred with </w:t>
+      </w:r>
+      <w:r>
+        <w:rPr>
+          <w:b/>
+          <w:bCs/>
+        </w:rPr>
+        <w:t xml:space="preserve">FastTree</w:t>
+      </w:r>
+      <w:r>
+        <w:t xml:space="preserve"> from the </w:t>
+      </w:r>
+      <w:r>
+        <w:rPr>
+          <w:b/>
+          <w:bCs/>
+        </w:rPr>
+        <w:t xml:space="preserve">MAFFT</w:t>
+      </w:r>
+      <w:r>
+        <w:t xml:space="preserve"> alignment of the five homologs (Galaxy pipeline). FastTree reports SH-like local support values. </w:t>
+      </w:r>
+      <w:r>
+        <w:t xml:space="preserve">FastTree returns an </w:t>
+      </w:r>
+      <w:r>
+        <w:rPr>
+          <w:b/>
+          <w:bCs/>
+        </w:rPr>
+        <w:t xml:space="preserve">unrooted</w:t>
+      </w:r>
+      <w:r>
+        <w:t xml:space="preserve"> tree, so the result was re-rooted on the Gram-positive outgroup </w:t>
+      </w:r>
+      <w:r>
+        <w:rPr>
+          <w:b/>
+          <w:bCs/>
+        </w:rPr>
+        <w:t xml:space="preserve">BlaZ/PC1</w:t>
+      </w:r>
+      <w:r>
+        <w:t xml:space="preserve"> for interpretation.</w:t>
       </w:r>
     </w:p>
     <w:p>
@@ -3007,9 +3354,9 @@
       <w:r>
         <w:drawing>
           <wp:inline distT="0" distB="0" distL="0" distR="0">
-            <wp:extent cx="5334000" cy="2809875"/>
+            <wp:extent cx="5334000" cy="2667000"/>
             <wp:effectExtent t="0" r="0" b="0" l="0"/>
-            <wp:docPr id="1" name="Figure 2. Neighbour-joining tree of the five class A β-lactamases." descr="Figure 2. Neighbour-joining tree of the five class A β-lactamases." title="Figure 2. Neighbour-joining tree of the five class A β-lactamases."/>
+            <wp:docPr id="1" name="Figure 2. FastTree phylogeny of the five class A β-lactamases, rooted on the BlaZ outgroup. Numbers are SH-like supports." descr="Figure 2. FastTree phylogeny of the five class A β-lactamases, rooted on the BlaZ outgroup. Numbers are SH-like supports." title="Figure 2. FastTree phylogeny of the five class A β-lactamases, rooted on the BlaZ outgroup. Numbers are SH-like supports."/>
             <wp:cNvGraphicFramePr>
               <a:graphicFrameLocks xmlns:a="http://schemas.openxmlformats.org/drawingml/2006/main" noChangeAspect="1"/>
             </wp:cNvGraphicFramePr>
@@ -3032,7 +3379,7 @@
                   <pic:spPr bwMode="auto">
                     <a:xfrm>
                       <a:off x="0" y="0"/>
-                      <a:ext cx="5334000" cy="2809875"/>
+                      <a:ext cx="5334000" cy="2667000"/>
                     </a:xfrm>
                     <a:prstGeom prst="rect">
                       <a:avLst/>
@@ -3058,7 +3405,32 @@
           <w:sz w:val="18"/>
           <w:szCs w:val="18"/>
         </w:rPr>
-        <w:t xml:space="preserve">Figure 2. Neighbour-joining tree of the five class A β-lactamases.</w:t>
+        <w:t xml:space="preserve">Figure 2. FastTree phylogeny of the five class A β-lactamases, rooted on the BlaZ outgroup. Numbers are SH-like supports.</w:t>
+      </w:r>
+    </w:p>
+    <w:p>
+      <w:pPr>
+        <w:spacing w:after="140" w:line="276"/>
+      </w:pPr>
+      <w:r>
+        <w:rPr>
+          <w:i/>
+          <w:iCs/>
+        </w:rPr>
+        <w:t xml:space="preserve">Methodological note: </w:t>
+      </w:r>
+      <w:r>
+        <w:t xml:space="preserve">the raw Newick Display output appeared to pair CTX-M-15 with BlaZ — this was an </w:t>
+      </w:r>
+      <w:r>
+        <w:rPr>
+          <w:b/>
+          <w:bCs/>
+        </w:rPr>
+        <w:t xml:space="preserve">artifact of displaying an unrooted tree</w:t>
+      </w:r>
+      <w:r>
+        <w:t xml:space="preserve"> with arbitrary rooting (note the basal trifurcation in the FastTree Newick), compounded by BlaZ's very long branch (long-branch attraction). Explicit outgroup rooting removes the artifact.</w:t>
       </w:r>
     </w:p>
     <w:p>
@@ -3086,7 +3458,7 @@
         <w:t xml:space="preserve">SHV-1 and SHV-2 cluster almost on top of each other</w:t>
       </w:r>
       <w:r>
-        <w:t xml:space="preserve"> (distance ≈ 0.004). They differ by a </w:t>
+        <w:t xml:space="preserve"> (branch length ≈ 0). They differ by a </w:t>
       </w:r>
       <w:r>
         <w:rPr>
@@ -3096,7 +3468,7 @@
         <w:t xml:space="preserve">single residue</w:t>
       </w:r>
       <w:r>
-        <w:t xml:space="preserve"> — the G→S substitution at the K-[S/T]-G+2 position that converts the narrow-spectrum SHV-1 into the extended-spectrum ESBL SHV-2. A one-amino-acid change with a major clinical phenotype.</w:t>
+        <w:t xml:space="preserve"> — the G→S substitution that converts the narrow-spectrum SHV-1 into the extended-spectrum ESBL SHV-2. A one-amino-acid change with a major clinical phenotype.</w:t>
       </w:r>
     </w:p>
     <w:p>
@@ -3116,17 +3488,17 @@
         <w:t xml:space="preserve">TEM-1 groups with the SHV clade</w:t>
       </w:r>
       <w:r>
-        <w:t xml:space="preserve"> (both Enterobacteriaceae, distance ≈ 0.34), while </w:t>
-      </w:r>
-      <w:r>
-        <w:rPr>
-          <w:b/>
-          <w:bCs/>
-        </w:rPr>
-        <w:t xml:space="preserve">CTX-M-15 sits on its own branch</w:t>
-      </w:r>
-      <w:r>
-        <w:t xml:space="preserve"> (≈ 0.63–0.65) — consistent with CTX-M enzymes having a distinct evolutionary origin (mobilised from </w:t>
+        <w:t xml:space="preserve"> (both Enterobacteriaceae), while </w:t>
+      </w:r>
+      <w:r>
+        <w:rPr>
+          <w:b/>
+          <w:bCs/>
+        </w:rPr>
+        <w:t xml:space="preserve">CTX-M-15 diverges earlier</w:t>
+      </w:r>
+      <w:r>
+        <w:t xml:space="preserve"> — consistent with CTX-M enzymes having a distinct evolutionary origin (mobilised from </w:t>
       </w:r>
       <w:r>
         <w:rPr>
@@ -3136,7 +3508,7 @@
         <w:t xml:space="preserve">Kluyvera</w:t>
       </w:r>
       <w:r>
-        <w:t xml:space="preserve"> chromosomal genes).</w:t>
+        <w:t xml:space="preserve"> chromosomal genes). Internal supports are high (0.99–1.00).</w:t>
       </w:r>
     </w:p>
     <w:p>
@@ -3153,10 +3525,10 @@
           <w:b/>
           <w:bCs/>
         </w:rPr>
-        <w:t xml:space="preserve">BlaZ/PC1 (S. aureus) is the most distant</w:t>
-      </w:r>
-      <w:r>
-        <w:t xml:space="preserve"> (≈ 0.71–0.74) and roots the tree — the Gram-positive enzyme separates cleanly from the Gram-negative clade.</w:t>
+        <w:t xml:space="preserve">BlaZ/PC1 (S. aureus) roots the tree</w:t>
+      </w:r>
+      <w:r>
+        <w:t xml:space="preserve"> — the Gram-positive enzyme separates cleanly from the Gram-negative clade.</w:t>
       </w:r>
     </w:p>
     <w:p>

</xml_diff>